<commit_message>
New files for version V1.1
</commit_message>
<xml_diff>
--- a/critique_website/assets/Ideas.docx
+++ b/critique_website/assets/Ideas.docx
@@ -114,6 +114,593 @@
         <w:t>write the website’s explanatory section after the hero page.</w:t>
       </w:r>
     </w:p>
+    <w:p>
+      <w:r>
+        <w:t>11. make each section different and more dynamic with animations and scrolling effects</w:t>
+      </w:r>
+    </w:p>
+    <w:p>
+      <w:r>
+        <w:t xml:space="preserve">12. </w:t>
+      </w:r>
+    </w:p>
+    <w:p>
+      <w:pPr>
+        <w:rPr>
+          <w:b/>
+          <w:bCs/>
+        </w:rPr>
+      </w:pPr>
+      <w:r>
+        <w:rPr>
+          <w:rFonts w:ascii="Segoe UI Emoji" w:hAnsi="Segoe UI Emoji" w:cs="Segoe UI Emoji"/>
+          <w:b/>
+          <w:bCs/>
+        </w:rPr>
+        <w:t>🧩</w:t>
+      </w:r>
+      <w:r>
+        <w:rPr>
+          <w:b/>
+          <w:bCs/>
+        </w:rPr>
+        <w:t xml:space="preserve"> Product Thinking (THIS is the differentiator)</w:t>
+      </w:r>
+    </w:p>
+    <w:p>
+      <w:pPr>
+        <w:numPr>
+          <w:ilvl w:val="0"/>
+          <w:numId w:val="2"/>
+        </w:numPr>
+      </w:pPr>
+      <w:r>
+        <w:t xml:space="preserve">Who is it for? </w:t>
+      </w:r>
+    </w:p>
+    <w:p>
+      <w:pPr>
+        <w:numPr>
+          <w:ilvl w:val="1"/>
+          <w:numId w:val="2"/>
+        </w:numPr>
+      </w:pPr>
+      <w:r>
+        <w:t xml:space="preserve">Writers? </w:t>
+      </w:r>
+    </w:p>
+    <w:p>
+      <w:pPr>
+        <w:numPr>
+          <w:ilvl w:val="1"/>
+          <w:numId w:val="2"/>
+        </w:numPr>
+      </w:pPr>
+      <w:r>
+        <w:t xml:space="preserve">Students? </w:t>
+      </w:r>
+    </w:p>
+    <w:p>
+      <w:pPr>
+        <w:numPr>
+          <w:ilvl w:val="1"/>
+          <w:numId w:val="2"/>
+        </w:numPr>
+      </w:pPr>
+      <w:r>
+        <w:t xml:space="preserve">Devs? </w:t>
+      </w:r>
+    </w:p>
+    <w:p>
+      <w:pPr>
+        <w:numPr>
+          <w:ilvl w:val="0"/>
+          <w:numId w:val="2"/>
+        </w:numPr>
+      </w:pPr>
+      <w:r>
+        <w:t>What problem does it solve?</w:t>
+      </w:r>
+    </w:p>
+    <w:p/>
+    <w:p>
+      <w:pPr>
+        <w:rPr>
+          <w:b/>
+          <w:bCs/>
+        </w:rPr>
+      </w:pPr>
+      <w:r>
+        <w:rPr>
+          <w:rFonts w:ascii="Segoe UI Emoji" w:hAnsi="Segoe UI Emoji" w:cs="Segoe UI Emoji"/>
+          <w:b/>
+          <w:bCs/>
+        </w:rPr>
+        <w:lastRenderedPageBreak/>
+        <w:t>⚙️</w:t>
+      </w:r>
+      <w:r>
+        <w:rPr>
+          <w:b/>
+          <w:bCs/>
+        </w:rPr>
+        <w:t xml:space="preserve"> Features that elevate it:</w:t>
+      </w:r>
+    </w:p>
+    <w:p>
+      <w:pPr>
+        <w:numPr>
+          <w:ilvl w:val="0"/>
+          <w:numId w:val="3"/>
+        </w:numPr>
+      </w:pPr>
+      <w:r>
+        <w:t xml:space="preserve">Authentication (already expected) </w:t>
+      </w:r>
+    </w:p>
+    <w:p>
+      <w:pPr>
+        <w:numPr>
+          <w:ilvl w:val="0"/>
+          <w:numId w:val="3"/>
+        </w:numPr>
+      </w:pPr>
+      <w:r>
+        <w:t xml:space="preserve">Draft system + auto-save </w:t>
+      </w:r>
+    </w:p>
+    <w:p>
+      <w:pPr>
+        <w:numPr>
+          <w:ilvl w:val="0"/>
+          <w:numId w:val="3"/>
+        </w:numPr>
+      </w:pPr>
+      <w:r>
+        <w:t xml:space="preserve">Rich editor (you already noticed UX issues—good sign) </w:t>
+      </w:r>
+    </w:p>
+    <w:p>
+      <w:pPr>
+        <w:numPr>
+          <w:ilvl w:val="0"/>
+          <w:numId w:val="3"/>
+        </w:numPr>
+      </w:pPr>
+      <w:r>
+        <w:t>Image handling (</w:t>
+      </w:r>
+      <w:proofErr w:type="spellStart"/>
+      <w:r>
+        <w:t>Cloudinary</w:t>
+      </w:r>
+      <w:proofErr w:type="spellEnd"/>
+      <w:r>
+        <w:t xml:space="preserve"> etc.) </w:t>
+      </w:r>
+    </w:p>
+    <w:p>
+      <w:pPr>
+        <w:numPr>
+          <w:ilvl w:val="0"/>
+          <w:numId w:val="3"/>
+        </w:numPr>
+      </w:pPr>
+      <w:r>
+        <w:t xml:space="preserve">Search + filters </w:t>
+      </w:r>
+    </w:p>
+    <w:p>
+      <w:pPr>
+        <w:numPr>
+          <w:ilvl w:val="0"/>
+          <w:numId w:val="3"/>
+        </w:numPr>
+      </w:pPr>
+      <w:r>
+        <w:t xml:space="preserve">Comments / engagement </w:t>
+      </w:r>
+    </w:p>
+    <w:p>
+      <w:pPr>
+        <w:numPr>
+          <w:ilvl w:val="0"/>
+          <w:numId w:val="3"/>
+        </w:numPr>
+      </w:pPr>
+      <w:r>
+        <w:t xml:space="preserve">Analytics dashboard (huge boost) </w:t>
+      </w:r>
+    </w:p>
+    <w:p>
+      <w:pPr>
+        <w:numPr>
+          <w:ilvl w:val="0"/>
+          <w:numId w:val="3"/>
+        </w:numPr>
+      </w:pPr>
+      <w:r>
+        <w:t>SEO optimization</w:t>
+      </w:r>
+    </w:p>
+    <w:p>
+      <w:pPr>
+        <w:rPr>
+          <w:b/>
+          <w:bCs/>
+        </w:rPr>
+      </w:pPr>
+      <w:r>
+        <w:rPr>
+          <w:rFonts w:ascii="Segoe UI Emoji" w:hAnsi="Segoe UI Emoji" w:cs="Segoe UI Emoji"/>
+          <w:b/>
+          <w:bCs/>
+        </w:rPr>
+        <w:t>🚀</w:t>
+      </w:r>
+      <w:r>
+        <w:rPr>
+          <w:b/>
+          <w:bCs/>
+        </w:rPr>
+        <w:t xml:space="preserve"> “Standout” additions (top 10% tier)</w:t>
+      </w:r>
+    </w:p>
+    <w:p>
+      <w:pPr>
+        <w:numPr>
+          <w:ilvl w:val="0"/>
+          <w:numId w:val="4"/>
+        </w:numPr>
+      </w:pPr>
+      <w:r>
+        <w:t xml:space="preserve">Markdown support </w:t>
+      </w:r>
+    </w:p>
+    <w:p>
+      <w:pPr>
+        <w:numPr>
+          <w:ilvl w:val="0"/>
+          <w:numId w:val="4"/>
+        </w:numPr>
+      </w:pPr>
+      <w:r>
+        <w:t xml:space="preserve">AI-assisted writing (even basic integration) </w:t>
+      </w:r>
+    </w:p>
+    <w:p>
+      <w:pPr>
+        <w:numPr>
+          <w:ilvl w:val="0"/>
+          <w:numId w:val="4"/>
+        </w:numPr>
+      </w:pPr>
+      <w:r>
+        <w:t xml:space="preserve">Reading time + recommendations </w:t>
+      </w:r>
+    </w:p>
+    <w:p>
+      <w:pPr>
+        <w:numPr>
+          <w:ilvl w:val="0"/>
+          <w:numId w:val="4"/>
+        </w:numPr>
+      </w:pPr>
+      <w:r>
+        <w:t xml:space="preserve">Bookmarking system </w:t>
+      </w:r>
+    </w:p>
+    <w:p/>
+    <w:p>
+      <w:pPr>
+        <w:rPr>
+          <w:b/>
+          <w:bCs/>
+        </w:rPr>
+      </w:pPr>
+      <w:r>
+        <w:rPr>
+          <w:b/>
+          <w:bCs/>
+        </w:rPr>
+        <w:t>Step 1: Add Scroll Animations (Immediate Upgrade)</w:t>
+      </w:r>
+    </w:p>
+    <w:p>
+      <w:r>
+        <w:t>Start with:</w:t>
+      </w:r>
+    </w:p>
+    <w:p>
+      <w:pPr>
+        <w:numPr>
+          <w:ilvl w:val="0"/>
+          <w:numId w:val="5"/>
+        </w:numPr>
+      </w:pPr>
+      <w:r>
+        <w:t xml:space="preserve">GSAP + </w:t>
+      </w:r>
+      <w:proofErr w:type="spellStart"/>
+      <w:r>
+        <w:t>ScrollTrigger</w:t>
+      </w:r>
+      <w:proofErr w:type="spellEnd"/>
+      <w:r>
+        <w:t xml:space="preserve"> </w:t>
+      </w:r>
+    </w:p>
+    <w:p>
+      <w:r>
+        <w:t>Add:</w:t>
+      </w:r>
+    </w:p>
+    <w:p>
+      <w:pPr>
+        <w:numPr>
+          <w:ilvl w:val="0"/>
+          <w:numId w:val="6"/>
+        </w:numPr>
+      </w:pPr>
+      <w:r>
+        <w:t xml:space="preserve">Fade-in on scroll </w:t>
+      </w:r>
+    </w:p>
+    <w:p>
+      <w:pPr>
+        <w:numPr>
+          <w:ilvl w:val="0"/>
+          <w:numId w:val="6"/>
+        </w:numPr>
+      </w:pPr>
+      <w:r>
+        <w:t xml:space="preserve">Image reveal </w:t>
+      </w:r>
+    </w:p>
+    <w:p>
+      <w:pPr>
+        <w:numPr>
+          <w:ilvl w:val="0"/>
+          <w:numId w:val="6"/>
+        </w:numPr>
+      </w:pPr>
+      <w:r>
+        <w:t xml:space="preserve">Section transitions </w:t>
+      </w:r>
+    </w:p>
+    <w:p>
+      <w:r>
+        <w:pict w14:anchorId="7D067A30">
+          <v:rect id="_x0000_i1049" style="width:0;height:1.5pt" o:hralign="center" o:hrstd="t" o:hr="t" fillcolor="#a0a0a0" stroked="f"/>
+        </w:pict>
+      </w:r>
+    </w:p>
+    <w:p>
+      <w:pPr>
+        <w:rPr>
+          <w:b/>
+          <w:bCs/>
+        </w:rPr>
+      </w:pPr>
+      <w:r>
+        <w:rPr>
+          <w:rFonts w:ascii="Segoe UI Emoji" w:hAnsi="Segoe UI Emoji" w:cs="Segoe UI Emoji"/>
+          <w:b/>
+          <w:bCs/>
+        </w:rPr>
+        <w:t>✅</w:t>
+      </w:r>
+      <w:r>
+        <w:rPr>
+          <w:b/>
+          <w:bCs/>
+        </w:rPr>
+        <w:t xml:space="preserve"> Step 2: Improve Motion System</w:t>
+      </w:r>
+    </w:p>
+    <w:p>
+      <w:r>
+        <w:t>Introduce:</w:t>
+      </w:r>
+    </w:p>
+    <w:p>
+      <w:pPr>
+        <w:numPr>
+          <w:ilvl w:val="0"/>
+          <w:numId w:val="7"/>
+        </w:numPr>
+      </w:pPr>
+      <w:r>
+        <w:t xml:space="preserve">Stagger animations </w:t>
+      </w:r>
+    </w:p>
+    <w:p>
+      <w:pPr>
+        <w:numPr>
+          <w:ilvl w:val="0"/>
+          <w:numId w:val="7"/>
+        </w:numPr>
+      </w:pPr>
+      <w:r>
+        <w:lastRenderedPageBreak/>
+        <w:t xml:space="preserve">Delays </w:t>
+      </w:r>
+    </w:p>
+    <w:p>
+      <w:pPr>
+        <w:numPr>
+          <w:ilvl w:val="0"/>
+          <w:numId w:val="7"/>
+        </w:numPr>
+      </w:pPr>
+      <w:r>
+        <w:t xml:space="preserve">Easing functions </w:t>
+      </w:r>
+    </w:p>
+    <w:p>
+      <w:r>
+        <w:pict w14:anchorId="7C8A90C0">
+          <v:rect id="_x0000_i1050" style="width:0;height:1.5pt" o:hralign="center" o:hrstd="t" o:hr="t" fillcolor="#a0a0a0" stroked="f"/>
+        </w:pict>
+      </w:r>
+    </w:p>
+    <w:p>
+      <w:pPr>
+        <w:rPr>
+          <w:b/>
+          <w:bCs/>
+        </w:rPr>
+      </w:pPr>
+      <w:r>
+        <w:rPr>
+          <w:rFonts w:ascii="Segoe UI Emoji" w:hAnsi="Segoe UI Emoji" w:cs="Segoe UI Emoji"/>
+          <w:b/>
+          <w:bCs/>
+        </w:rPr>
+        <w:t>✅</w:t>
+      </w:r>
+      <w:r>
+        <w:rPr>
+          <w:b/>
+          <w:bCs/>
+        </w:rPr>
+        <w:t xml:space="preserve"> Step 3: Smooth Scrolling</w:t>
+      </w:r>
+    </w:p>
+    <w:p>
+      <w:r>
+        <w:t>Add:</w:t>
+      </w:r>
+    </w:p>
+    <w:p>
+      <w:pPr>
+        <w:numPr>
+          <w:ilvl w:val="0"/>
+          <w:numId w:val="8"/>
+        </w:numPr>
+      </w:pPr>
+      <w:r>
+        <w:t xml:space="preserve">Lenis (modern and clean) </w:t>
+      </w:r>
+    </w:p>
+    <w:p>
+      <w:r>
+        <w:pict w14:anchorId="6AE005C4">
+          <v:rect id="_x0000_i1051" style="width:0;height:1.5pt" o:hralign="center" o:hrstd="t" o:hr="t" fillcolor="#a0a0a0" stroked="f"/>
+        </w:pict>
+      </w:r>
+    </w:p>
+    <w:p>
+      <w:pPr>
+        <w:rPr>
+          <w:b/>
+          <w:bCs/>
+        </w:rPr>
+      </w:pPr>
+      <w:r>
+        <w:rPr>
+          <w:rFonts w:ascii="Segoe UI Emoji" w:hAnsi="Segoe UI Emoji" w:cs="Segoe UI Emoji"/>
+          <w:b/>
+          <w:bCs/>
+        </w:rPr>
+        <w:t>✅</w:t>
+      </w:r>
+      <w:r>
+        <w:rPr>
+          <w:b/>
+          <w:bCs/>
+        </w:rPr>
+        <w:t xml:space="preserve"> Step 4: Component-Based UI (Important)</w:t>
+      </w:r>
+    </w:p>
+    <w:p>
+      <w:r>
+        <w:t>Move toward:</w:t>
+      </w:r>
+    </w:p>
+    <w:p>
+      <w:pPr>
+        <w:numPr>
+          <w:ilvl w:val="0"/>
+          <w:numId w:val="9"/>
+        </w:numPr>
+      </w:pPr>
+      <w:r>
+        <w:t xml:space="preserve">Next.js (since you're already deploying on </w:t>
+      </w:r>
+      <w:proofErr w:type="spellStart"/>
+      <w:r>
+        <w:t>Vercel</w:t>
+      </w:r>
+      <w:proofErr w:type="spellEnd"/>
+      <w:r>
+        <w:t xml:space="preserve">) </w:t>
+      </w:r>
+    </w:p>
+    <w:p>
+      <w:r>
+        <w:pict w14:anchorId="2F4A1F53">
+          <v:rect id="_x0000_i1052" style="width:0;height:1.5pt" o:hralign="center" o:hrstd="t" o:hr="t" fillcolor="#a0a0a0" stroked="f"/>
+        </w:pict>
+      </w:r>
+    </w:p>
+    <w:p>
+      <w:pPr>
+        <w:rPr>
+          <w:b/>
+          <w:bCs/>
+        </w:rPr>
+      </w:pPr>
+      <w:r>
+        <w:rPr>
+          <w:rFonts w:ascii="Segoe UI Emoji" w:hAnsi="Segoe UI Emoji" w:cs="Segoe UI Emoji"/>
+          <w:b/>
+          <w:bCs/>
+        </w:rPr>
+        <w:t>✅</w:t>
+      </w:r>
+      <w:r>
+        <w:rPr>
+          <w:b/>
+          <w:bCs/>
+        </w:rPr>
+        <w:t xml:space="preserve"> Step 5: Micro-interactions</w:t>
+      </w:r>
+    </w:p>
+    <w:p>
+      <w:pPr>
+        <w:numPr>
+          <w:ilvl w:val="0"/>
+          <w:numId w:val="10"/>
+        </w:numPr>
+      </w:pPr>
+      <w:r>
+        <w:t xml:space="preserve">Hover animations </w:t>
+      </w:r>
+    </w:p>
+    <w:p>
+      <w:pPr>
+        <w:numPr>
+          <w:ilvl w:val="0"/>
+          <w:numId w:val="10"/>
+        </w:numPr>
+      </w:pPr>
+      <w:r>
+        <w:t xml:space="preserve">Button feedback </w:t>
+      </w:r>
+    </w:p>
+    <w:p>
+      <w:pPr>
+        <w:numPr>
+          <w:ilvl w:val="0"/>
+          <w:numId w:val="10"/>
+        </w:numPr>
+      </w:pPr>
+      <w:r>
+        <w:t>Card scaling</w:t>
+      </w:r>
+    </w:p>
+    <w:p/>
     <w:sectPr>
       <w:pgSz w:w="12240" w:h="15840"/>
       <w:pgMar w:top="1440" w:right="1440" w:bottom="1440" w:left="1440" w:header="720" w:footer="720" w:gutter="0"/>
@@ -122,6 +709,1531 @@
     </w:sectPr>
   </w:body>
 </w:document>
+</file>
+
+<file path=word/numbering.xml><?xml version="1.0" encoding="utf-8"?>
+<w:numbering xmlns:wpc="http://schemas.microsoft.com/office/word/2010/wordprocessingCanvas" xmlns:cx="http://schemas.microsoft.com/office/drawing/2014/chartex" xmlns:cx1="http://schemas.microsoft.com/office/drawing/2015/9/8/chartex" xmlns:cx2="http://schemas.microsoft.com/office/drawing/2015/10/21/chartex" xmlns:cx3="http://schemas.microsoft.com/office/drawing/2016/5/9/chartex" xmlns:cx4="http://schemas.microsoft.com/office/drawing/2016/5/10/chartex" xmlns:cx5="http://schemas.microsoft.com/office/drawing/2016/5/11/chartex" xmlns:cx6="http://schemas.microsoft.com/office/drawing/2016/5/12/chartex" xmlns:cx7="http://schemas.microsoft.com/office/drawing/2016/5/13/chartex" xmlns:cx8="http://schemas.microsoft.com/office/drawing/2016/5/14/chartex" xmlns:mc="http://schemas.openxmlformats.org/markup-compatibility/2006" xmlns:aink="http://schemas.microsoft.com/office/drawing/2016/ink" xmlns:am3d="http://schemas.microsoft.com/office/drawing/2017/model3d" xmlns:o="urn:schemas-microsoft-com:office:office" xmlns:oel="http://schemas.microsoft.com/office/2019/extlst" xmlns:r="http://schemas.openxmlformats.org/officeDocument/2006/relationships" xmlns:m="http://schemas.openxmlformats.org/officeDocument/2006/math" xmlns:v="urn:schemas-microsoft-com:vml" xmlns:wp14="http://schemas.microsoft.com/office/word/2010/wordprocessingDrawing" xmlns:wp="http://schemas.openxmlformats.org/drawingml/2006/wordprocessingDrawing" xmlns:w10="urn:schemas-microsoft-com:office:word" xmlns:w="http://schemas.openxmlformats.org/wordprocessingml/2006/main" xmlns:w14="http://schemas.microsoft.com/office/word/2010/wordml" xmlns:w15="http://schemas.microsoft.com/office/word/2012/wordml" xmlns:w16cex="http://schemas.microsoft.com/office/word/2018/wordml/cex" xmlns:w16cid="http://schemas.microsoft.com/office/word/2016/wordml/cid" xmlns:w16="http://schemas.microsoft.com/office/word/2018/wordml" xmlns:w16du="http://schemas.microsoft.com/office/word/2023/wordml/word16du" xmlns:w16sdtdh="http://schemas.microsoft.com/office/word/2020/wordml/sdtdatahash" xmlns:w16sdtfl="http://schemas.microsoft.com/office/word/2024/wordml/sdtformatlock" xmlns:w16se="http://schemas.microsoft.com/office/word/2015/wordml/symex" xmlns:wpg="http://schemas.microsoft.com/office/word/2010/wordprocessingGroup" xmlns:wpi="http://schemas.microsoft.com/office/word/2010/wordprocessingInk" xmlns:wne="http://schemas.microsoft.com/office/word/2006/wordml" xmlns:wps="http://schemas.microsoft.com/office/word/2010/wordprocessingShape" mc:Ignorable="w14 w15 w16se w16cid w16 w16cex w16sdtdh w16sdtfl w16du wp14">
+  <w:abstractNum w:abstractNumId="0" w15:restartNumberingAfterBreak="0">
+    <w:nsid w:val="29137C8A"/>
+    <w:multiLevelType w:val="multilevel"/>
+    <w:tmpl w:val="02246358"/>
+    <w:lvl w:ilvl="0">
+      <w:start w:val="1"/>
+      <w:numFmt w:val="bullet"/>
+      <w:lvlText w:val=""/>
+      <w:lvlJc w:val="left"/>
+      <w:pPr>
+        <w:tabs>
+          <w:tab w:val="num" w:pos="720"/>
+        </w:tabs>
+        <w:ind w:left="720" w:hanging="360"/>
+      </w:pPr>
+      <w:rPr>
+        <w:rFonts w:ascii="Symbol" w:hAnsi="Symbol" w:hint="default"/>
+        <w:sz w:val="20"/>
+      </w:rPr>
+    </w:lvl>
+    <w:lvl w:ilvl="1">
+      <w:start w:val="1"/>
+      <w:numFmt w:val="bullet"/>
+      <w:lvlText w:val="o"/>
+      <w:lvlJc w:val="left"/>
+      <w:pPr>
+        <w:tabs>
+          <w:tab w:val="num" w:pos="1440"/>
+        </w:tabs>
+        <w:ind w:left="1440" w:hanging="360"/>
+      </w:pPr>
+      <w:rPr>
+        <w:rFonts w:ascii="Courier New" w:hAnsi="Courier New" w:hint="default"/>
+        <w:sz w:val="20"/>
+      </w:rPr>
+    </w:lvl>
+    <w:lvl w:ilvl="2" w:tentative="1">
+      <w:start w:val="1"/>
+      <w:numFmt w:val="bullet"/>
+      <w:lvlText w:val=""/>
+      <w:lvlJc w:val="left"/>
+      <w:pPr>
+        <w:tabs>
+          <w:tab w:val="num" w:pos="2160"/>
+        </w:tabs>
+        <w:ind w:left="2160" w:hanging="360"/>
+      </w:pPr>
+      <w:rPr>
+        <w:rFonts w:ascii="Wingdings" w:hAnsi="Wingdings" w:hint="default"/>
+        <w:sz w:val="20"/>
+      </w:rPr>
+    </w:lvl>
+    <w:lvl w:ilvl="3" w:tentative="1">
+      <w:start w:val="1"/>
+      <w:numFmt w:val="bullet"/>
+      <w:lvlText w:val=""/>
+      <w:lvlJc w:val="left"/>
+      <w:pPr>
+        <w:tabs>
+          <w:tab w:val="num" w:pos="2880"/>
+        </w:tabs>
+        <w:ind w:left="2880" w:hanging="360"/>
+      </w:pPr>
+      <w:rPr>
+        <w:rFonts w:ascii="Wingdings" w:hAnsi="Wingdings" w:hint="default"/>
+        <w:sz w:val="20"/>
+      </w:rPr>
+    </w:lvl>
+    <w:lvl w:ilvl="4" w:tentative="1">
+      <w:start w:val="1"/>
+      <w:numFmt w:val="bullet"/>
+      <w:lvlText w:val=""/>
+      <w:lvlJc w:val="left"/>
+      <w:pPr>
+        <w:tabs>
+          <w:tab w:val="num" w:pos="3600"/>
+        </w:tabs>
+        <w:ind w:left="3600" w:hanging="360"/>
+      </w:pPr>
+      <w:rPr>
+        <w:rFonts w:ascii="Wingdings" w:hAnsi="Wingdings" w:hint="default"/>
+        <w:sz w:val="20"/>
+      </w:rPr>
+    </w:lvl>
+    <w:lvl w:ilvl="5" w:tentative="1">
+      <w:start w:val="1"/>
+      <w:numFmt w:val="bullet"/>
+      <w:lvlText w:val=""/>
+      <w:lvlJc w:val="left"/>
+      <w:pPr>
+        <w:tabs>
+          <w:tab w:val="num" w:pos="4320"/>
+        </w:tabs>
+        <w:ind w:left="4320" w:hanging="360"/>
+      </w:pPr>
+      <w:rPr>
+        <w:rFonts w:ascii="Wingdings" w:hAnsi="Wingdings" w:hint="default"/>
+        <w:sz w:val="20"/>
+      </w:rPr>
+    </w:lvl>
+    <w:lvl w:ilvl="6" w:tentative="1">
+      <w:start w:val="1"/>
+      <w:numFmt w:val="bullet"/>
+      <w:lvlText w:val=""/>
+      <w:lvlJc w:val="left"/>
+      <w:pPr>
+        <w:tabs>
+          <w:tab w:val="num" w:pos="5040"/>
+        </w:tabs>
+        <w:ind w:left="5040" w:hanging="360"/>
+      </w:pPr>
+      <w:rPr>
+        <w:rFonts w:ascii="Wingdings" w:hAnsi="Wingdings" w:hint="default"/>
+        <w:sz w:val="20"/>
+      </w:rPr>
+    </w:lvl>
+    <w:lvl w:ilvl="7" w:tentative="1">
+      <w:start w:val="1"/>
+      <w:numFmt w:val="bullet"/>
+      <w:lvlText w:val=""/>
+      <w:lvlJc w:val="left"/>
+      <w:pPr>
+        <w:tabs>
+          <w:tab w:val="num" w:pos="5760"/>
+        </w:tabs>
+        <w:ind w:left="5760" w:hanging="360"/>
+      </w:pPr>
+      <w:rPr>
+        <w:rFonts w:ascii="Wingdings" w:hAnsi="Wingdings" w:hint="default"/>
+        <w:sz w:val="20"/>
+      </w:rPr>
+    </w:lvl>
+    <w:lvl w:ilvl="8" w:tentative="1">
+      <w:start w:val="1"/>
+      <w:numFmt w:val="bullet"/>
+      <w:lvlText w:val=""/>
+      <w:lvlJc w:val="left"/>
+      <w:pPr>
+        <w:tabs>
+          <w:tab w:val="num" w:pos="6480"/>
+        </w:tabs>
+        <w:ind w:left="6480" w:hanging="360"/>
+      </w:pPr>
+      <w:rPr>
+        <w:rFonts w:ascii="Wingdings" w:hAnsi="Wingdings" w:hint="default"/>
+        <w:sz w:val="20"/>
+      </w:rPr>
+    </w:lvl>
+  </w:abstractNum>
+  <w:abstractNum w:abstractNumId="1" w15:restartNumberingAfterBreak="0">
+    <w:nsid w:val="2C4F055B"/>
+    <w:multiLevelType w:val="multilevel"/>
+    <w:tmpl w:val="249CD360"/>
+    <w:lvl w:ilvl="0">
+      <w:start w:val="1"/>
+      <w:numFmt w:val="bullet"/>
+      <w:lvlText w:val=""/>
+      <w:lvlJc w:val="left"/>
+      <w:pPr>
+        <w:tabs>
+          <w:tab w:val="num" w:pos="720"/>
+        </w:tabs>
+        <w:ind w:left="720" w:hanging="360"/>
+      </w:pPr>
+      <w:rPr>
+        <w:rFonts w:ascii="Symbol" w:hAnsi="Symbol" w:hint="default"/>
+        <w:sz w:val="20"/>
+      </w:rPr>
+    </w:lvl>
+    <w:lvl w:ilvl="1" w:tentative="1">
+      <w:start w:val="1"/>
+      <w:numFmt w:val="bullet"/>
+      <w:lvlText w:val="o"/>
+      <w:lvlJc w:val="left"/>
+      <w:pPr>
+        <w:tabs>
+          <w:tab w:val="num" w:pos="1440"/>
+        </w:tabs>
+        <w:ind w:left="1440" w:hanging="360"/>
+      </w:pPr>
+      <w:rPr>
+        <w:rFonts w:ascii="Courier New" w:hAnsi="Courier New" w:hint="default"/>
+        <w:sz w:val="20"/>
+      </w:rPr>
+    </w:lvl>
+    <w:lvl w:ilvl="2" w:tentative="1">
+      <w:start w:val="1"/>
+      <w:numFmt w:val="bullet"/>
+      <w:lvlText w:val=""/>
+      <w:lvlJc w:val="left"/>
+      <w:pPr>
+        <w:tabs>
+          <w:tab w:val="num" w:pos="2160"/>
+        </w:tabs>
+        <w:ind w:left="2160" w:hanging="360"/>
+      </w:pPr>
+      <w:rPr>
+        <w:rFonts w:ascii="Wingdings" w:hAnsi="Wingdings" w:hint="default"/>
+        <w:sz w:val="20"/>
+      </w:rPr>
+    </w:lvl>
+    <w:lvl w:ilvl="3" w:tentative="1">
+      <w:start w:val="1"/>
+      <w:numFmt w:val="bullet"/>
+      <w:lvlText w:val=""/>
+      <w:lvlJc w:val="left"/>
+      <w:pPr>
+        <w:tabs>
+          <w:tab w:val="num" w:pos="2880"/>
+        </w:tabs>
+        <w:ind w:left="2880" w:hanging="360"/>
+      </w:pPr>
+      <w:rPr>
+        <w:rFonts w:ascii="Wingdings" w:hAnsi="Wingdings" w:hint="default"/>
+        <w:sz w:val="20"/>
+      </w:rPr>
+    </w:lvl>
+    <w:lvl w:ilvl="4" w:tentative="1">
+      <w:start w:val="1"/>
+      <w:numFmt w:val="bullet"/>
+      <w:lvlText w:val=""/>
+      <w:lvlJc w:val="left"/>
+      <w:pPr>
+        <w:tabs>
+          <w:tab w:val="num" w:pos="3600"/>
+        </w:tabs>
+        <w:ind w:left="3600" w:hanging="360"/>
+      </w:pPr>
+      <w:rPr>
+        <w:rFonts w:ascii="Wingdings" w:hAnsi="Wingdings" w:hint="default"/>
+        <w:sz w:val="20"/>
+      </w:rPr>
+    </w:lvl>
+    <w:lvl w:ilvl="5" w:tentative="1">
+      <w:start w:val="1"/>
+      <w:numFmt w:val="bullet"/>
+      <w:lvlText w:val=""/>
+      <w:lvlJc w:val="left"/>
+      <w:pPr>
+        <w:tabs>
+          <w:tab w:val="num" w:pos="4320"/>
+        </w:tabs>
+        <w:ind w:left="4320" w:hanging="360"/>
+      </w:pPr>
+      <w:rPr>
+        <w:rFonts w:ascii="Wingdings" w:hAnsi="Wingdings" w:hint="default"/>
+        <w:sz w:val="20"/>
+      </w:rPr>
+    </w:lvl>
+    <w:lvl w:ilvl="6" w:tentative="1">
+      <w:start w:val="1"/>
+      <w:numFmt w:val="bullet"/>
+      <w:lvlText w:val=""/>
+      <w:lvlJc w:val="left"/>
+      <w:pPr>
+        <w:tabs>
+          <w:tab w:val="num" w:pos="5040"/>
+        </w:tabs>
+        <w:ind w:left="5040" w:hanging="360"/>
+      </w:pPr>
+      <w:rPr>
+        <w:rFonts w:ascii="Wingdings" w:hAnsi="Wingdings" w:hint="default"/>
+        <w:sz w:val="20"/>
+      </w:rPr>
+    </w:lvl>
+    <w:lvl w:ilvl="7" w:tentative="1">
+      <w:start w:val="1"/>
+      <w:numFmt w:val="bullet"/>
+      <w:lvlText w:val=""/>
+      <w:lvlJc w:val="left"/>
+      <w:pPr>
+        <w:tabs>
+          <w:tab w:val="num" w:pos="5760"/>
+        </w:tabs>
+        <w:ind w:left="5760" w:hanging="360"/>
+      </w:pPr>
+      <w:rPr>
+        <w:rFonts w:ascii="Wingdings" w:hAnsi="Wingdings" w:hint="default"/>
+        <w:sz w:val="20"/>
+      </w:rPr>
+    </w:lvl>
+    <w:lvl w:ilvl="8" w:tentative="1">
+      <w:start w:val="1"/>
+      <w:numFmt w:val="bullet"/>
+      <w:lvlText w:val=""/>
+      <w:lvlJc w:val="left"/>
+      <w:pPr>
+        <w:tabs>
+          <w:tab w:val="num" w:pos="6480"/>
+        </w:tabs>
+        <w:ind w:left="6480" w:hanging="360"/>
+      </w:pPr>
+      <w:rPr>
+        <w:rFonts w:ascii="Wingdings" w:hAnsi="Wingdings" w:hint="default"/>
+        <w:sz w:val="20"/>
+      </w:rPr>
+    </w:lvl>
+  </w:abstractNum>
+  <w:abstractNum w:abstractNumId="2" w15:restartNumberingAfterBreak="0">
+    <w:nsid w:val="473A3169"/>
+    <w:multiLevelType w:val="multilevel"/>
+    <w:tmpl w:val="98904474"/>
+    <w:lvl w:ilvl="0">
+      <w:start w:val="1"/>
+      <w:numFmt w:val="bullet"/>
+      <w:lvlText w:val=""/>
+      <w:lvlJc w:val="left"/>
+      <w:pPr>
+        <w:tabs>
+          <w:tab w:val="num" w:pos="720"/>
+        </w:tabs>
+        <w:ind w:left="720" w:hanging="360"/>
+      </w:pPr>
+      <w:rPr>
+        <w:rFonts w:ascii="Symbol" w:hAnsi="Symbol" w:hint="default"/>
+        <w:sz w:val="20"/>
+      </w:rPr>
+    </w:lvl>
+    <w:lvl w:ilvl="1" w:tentative="1">
+      <w:start w:val="1"/>
+      <w:numFmt w:val="bullet"/>
+      <w:lvlText w:val="o"/>
+      <w:lvlJc w:val="left"/>
+      <w:pPr>
+        <w:tabs>
+          <w:tab w:val="num" w:pos="1440"/>
+        </w:tabs>
+        <w:ind w:left="1440" w:hanging="360"/>
+      </w:pPr>
+      <w:rPr>
+        <w:rFonts w:ascii="Courier New" w:hAnsi="Courier New" w:hint="default"/>
+        <w:sz w:val="20"/>
+      </w:rPr>
+    </w:lvl>
+    <w:lvl w:ilvl="2" w:tentative="1">
+      <w:start w:val="1"/>
+      <w:numFmt w:val="bullet"/>
+      <w:lvlText w:val=""/>
+      <w:lvlJc w:val="left"/>
+      <w:pPr>
+        <w:tabs>
+          <w:tab w:val="num" w:pos="2160"/>
+        </w:tabs>
+        <w:ind w:left="2160" w:hanging="360"/>
+      </w:pPr>
+      <w:rPr>
+        <w:rFonts w:ascii="Wingdings" w:hAnsi="Wingdings" w:hint="default"/>
+        <w:sz w:val="20"/>
+      </w:rPr>
+    </w:lvl>
+    <w:lvl w:ilvl="3" w:tentative="1">
+      <w:start w:val="1"/>
+      <w:numFmt w:val="bullet"/>
+      <w:lvlText w:val=""/>
+      <w:lvlJc w:val="left"/>
+      <w:pPr>
+        <w:tabs>
+          <w:tab w:val="num" w:pos="2880"/>
+        </w:tabs>
+        <w:ind w:left="2880" w:hanging="360"/>
+      </w:pPr>
+      <w:rPr>
+        <w:rFonts w:ascii="Wingdings" w:hAnsi="Wingdings" w:hint="default"/>
+        <w:sz w:val="20"/>
+      </w:rPr>
+    </w:lvl>
+    <w:lvl w:ilvl="4" w:tentative="1">
+      <w:start w:val="1"/>
+      <w:numFmt w:val="bullet"/>
+      <w:lvlText w:val=""/>
+      <w:lvlJc w:val="left"/>
+      <w:pPr>
+        <w:tabs>
+          <w:tab w:val="num" w:pos="3600"/>
+        </w:tabs>
+        <w:ind w:left="3600" w:hanging="360"/>
+      </w:pPr>
+      <w:rPr>
+        <w:rFonts w:ascii="Wingdings" w:hAnsi="Wingdings" w:hint="default"/>
+        <w:sz w:val="20"/>
+      </w:rPr>
+    </w:lvl>
+    <w:lvl w:ilvl="5" w:tentative="1">
+      <w:start w:val="1"/>
+      <w:numFmt w:val="bullet"/>
+      <w:lvlText w:val=""/>
+      <w:lvlJc w:val="left"/>
+      <w:pPr>
+        <w:tabs>
+          <w:tab w:val="num" w:pos="4320"/>
+        </w:tabs>
+        <w:ind w:left="4320" w:hanging="360"/>
+      </w:pPr>
+      <w:rPr>
+        <w:rFonts w:ascii="Wingdings" w:hAnsi="Wingdings" w:hint="default"/>
+        <w:sz w:val="20"/>
+      </w:rPr>
+    </w:lvl>
+    <w:lvl w:ilvl="6" w:tentative="1">
+      <w:start w:val="1"/>
+      <w:numFmt w:val="bullet"/>
+      <w:lvlText w:val=""/>
+      <w:lvlJc w:val="left"/>
+      <w:pPr>
+        <w:tabs>
+          <w:tab w:val="num" w:pos="5040"/>
+        </w:tabs>
+        <w:ind w:left="5040" w:hanging="360"/>
+      </w:pPr>
+      <w:rPr>
+        <w:rFonts w:ascii="Wingdings" w:hAnsi="Wingdings" w:hint="default"/>
+        <w:sz w:val="20"/>
+      </w:rPr>
+    </w:lvl>
+    <w:lvl w:ilvl="7" w:tentative="1">
+      <w:start w:val="1"/>
+      <w:numFmt w:val="bullet"/>
+      <w:lvlText w:val=""/>
+      <w:lvlJc w:val="left"/>
+      <w:pPr>
+        <w:tabs>
+          <w:tab w:val="num" w:pos="5760"/>
+        </w:tabs>
+        <w:ind w:left="5760" w:hanging="360"/>
+      </w:pPr>
+      <w:rPr>
+        <w:rFonts w:ascii="Wingdings" w:hAnsi="Wingdings" w:hint="default"/>
+        <w:sz w:val="20"/>
+      </w:rPr>
+    </w:lvl>
+    <w:lvl w:ilvl="8" w:tentative="1">
+      <w:start w:val="1"/>
+      <w:numFmt w:val="bullet"/>
+      <w:lvlText w:val=""/>
+      <w:lvlJc w:val="left"/>
+      <w:pPr>
+        <w:tabs>
+          <w:tab w:val="num" w:pos="6480"/>
+        </w:tabs>
+        <w:ind w:left="6480" w:hanging="360"/>
+      </w:pPr>
+      <w:rPr>
+        <w:rFonts w:ascii="Wingdings" w:hAnsi="Wingdings" w:hint="default"/>
+        <w:sz w:val="20"/>
+      </w:rPr>
+    </w:lvl>
+  </w:abstractNum>
+  <w:abstractNum w:abstractNumId="3" w15:restartNumberingAfterBreak="0">
+    <w:nsid w:val="4B21001A"/>
+    <w:multiLevelType w:val="multilevel"/>
+    <w:tmpl w:val="09C0787C"/>
+    <w:lvl w:ilvl="0">
+      <w:start w:val="1"/>
+      <w:numFmt w:val="bullet"/>
+      <w:lvlText w:val=""/>
+      <w:lvlJc w:val="left"/>
+      <w:pPr>
+        <w:tabs>
+          <w:tab w:val="num" w:pos="720"/>
+        </w:tabs>
+        <w:ind w:left="720" w:hanging="360"/>
+      </w:pPr>
+      <w:rPr>
+        <w:rFonts w:ascii="Symbol" w:hAnsi="Symbol" w:hint="default"/>
+        <w:sz w:val="20"/>
+      </w:rPr>
+    </w:lvl>
+    <w:lvl w:ilvl="1" w:tentative="1">
+      <w:start w:val="1"/>
+      <w:numFmt w:val="bullet"/>
+      <w:lvlText w:val="o"/>
+      <w:lvlJc w:val="left"/>
+      <w:pPr>
+        <w:tabs>
+          <w:tab w:val="num" w:pos="1440"/>
+        </w:tabs>
+        <w:ind w:left="1440" w:hanging="360"/>
+      </w:pPr>
+      <w:rPr>
+        <w:rFonts w:ascii="Courier New" w:hAnsi="Courier New" w:hint="default"/>
+        <w:sz w:val="20"/>
+      </w:rPr>
+    </w:lvl>
+    <w:lvl w:ilvl="2" w:tentative="1">
+      <w:start w:val="1"/>
+      <w:numFmt w:val="bullet"/>
+      <w:lvlText w:val=""/>
+      <w:lvlJc w:val="left"/>
+      <w:pPr>
+        <w:tabs>
+          <w:tab w:val="num" w:pos="2160"/>
+        </w:tabs>
+        <w:ind w:left="2160" w:hanging="360"/>
+      </w:pPr>
+      <w:rPr>
+        <w:rFonts w:ascii="Wingdings" w:hAnsi="Wingdings" w:hint="default"/>
+        <w:sz w:val="20"/>
+      </w:rPr>
+    </w:lvl>
+    <w:lvl w:ilvl="3" w:tentative="1">
+      <w:start w:val="1"/>
+      <w:numFmt w:val="bullet"/>
+      <w:lvlText w:val=""/>
+      <w:lvlJc w:val="left"/>
+      <w:pPr>
+        <w:tabs>
+          <w:tab w:val="num" w:pos="2880"/>
+        </w:tabs>
+        <w:ind w:left="2880" w:hanging="360"/>
+      </w:pPr>
+      <w:rPr>
+        <w:rFonts w:ascii="Wingdings" w:hAnsi="Wingdings" w:hint="default"/>
+        <w:sz w:val="20"/>
+      </w:rPr>
+    </w:lvl>
+    <w:lvl w:ilvl="4" w:tentative="1">
+      <w:start w:val="1"/>
+      <w:numFmt w:val="bullet"/>
+      <w:lvlText w:val=""/>
+      <w:lvlJc w:val="left"/>
+      <w:pPr>
+        <w:tabs>
+          <w:tab w:val="num" w:pos="3600"/>
+        </w:tabs>
+        <w:ind w:left="3600" w:hanging="360"/>
+      </w:pPr>
+      <w:rPr>
+        <w:rFonts w:ascii="Wingdings" w:hAnsi="Wingdings" w:hint="default"/>
+        <w:sz w:val="20"/>
+      </w:rPr>
+    </w:lvl>
+    <w:lvl w:ilvl="5" w:tentative="1">
+      <w:start w:val="1"/>
+      <w:numFmt w:val="bullet"/>
+      <w:lvlText w:val=""/>
+      <w:lvlJc w:val="left"/>
+      <w:pPr>
+        <w:tabs>
+          <w:tab w:val="num" w:pos="4320"/>
+        </w:tabs>
+        <w:ind w:left="4320" w:hanging="360"/>
+      </w:pPr>
+      <w:rPr>
+        <w:rFonts w:ascii="Wingdings" w:hAnsi="Wingdings" w:hint="default"/>
+        <w:sz w:val="20"/>
+      </w:rPr>
+    </w:lvl>
+    <w:lvl w:ilvl="6" w:tentative="1">
+      <w:start w:val="1"/>
+      <w:numFmt w:val="bullet"/>
+      <w:lvlText w:val=""/>
+      <w:lvlJc w:val="left"/>
+      <w:pPr>
+        <w:tabs>
+          <w:tab w:val="num" w:pos="5040"/>
+        </w:tabs>
+        <w:ind w:left="5040" w:hanging="360"/>
+      </w:pPr>
+      <w:rPr>
+        <w:rFonts w:ascii="Wingdings" w:hAnsi="Wingdings" w:hint="default"/>
+        <w:sz w:val="20"/>
+      </w:rPr>
+    </w:lvl>
+    <w:lvl w:ilvl="7" w:tentative="1">
+      <w:start w:val="1"/>
+      <w:numFmt w:val="bullet"/>
+      <w:lvlText w:val=""/>
+      <w:lvlJc w:val="left"/>
+      <w:pPr>
+        <w:tabs>
+          <w:tab w:val="num" w:pos="5760"/>
+        </w:tabs>
+        <w:ind w:left="5760" w:hanging="360"/>
+      </w:pPr>
+      <w:rPr>
+        <w:rFonts w:ascii="Wingdings" w:hAnsi="Wingdings" w:hint="default"/>
+        <w:sz w:val="20"/>
+      </w:rPr>
+    </w:lvl>
+    <w:lvl w:ilvl="8" w:tentative="1">
+      <w:start w:val="1"/>
+      <w:numFmt w:val="bullet"/>
+      <w:lvlText w:val=""/>
+      <w:lvlJc w:val="left"/>
+      <w:pPr>
+        <w:tabs>
+          <w:tab w:val="num" w:pos="6480"/>
+        </w:tabs>
+        <w:ind w:left="6480" w:hanging="360"/>
+      </w:pPr>
+      <w:rPr>
+        <w:rFonts w:ascii="Wingdings" w:hAnsi="Wingdings" w:hint="default"/>
+        <w:sz w:val="20"/>
+      </w:rPr>
+    </w:lvl>
+  </w:abstractNum>
+  <w:abstractNum w:abstractNumId="4" w15:restartNumberingAfterBreak="0">
+    <w:nsid w:val="4B780317"/>
+    <w:multiLevelType w:val="multilevel"/>
+    <w:tmpl w:val="7678349E"/>
+    <w:lvl w:ilvl="0">
+      <w:start w:val="1"/>
+      <w:numFmt w:val="bullet"/>
+      <w:lvlText w:val=""/>
+      <w:lvlJc w:val="left"/>
+      <w:pPr>
+        <w:tabs>
+          <w:tab w:val="num" w:pos="720"/>
+        </w:tabs>
+        <w:ind w:left="720" w:hanging="360"/>
+      </w:pPr>
+      <w:rPr>
+        <w:rFonts w:ascii="Symbol" w:hAnsi="Symbol" w:hint="default"/>
+        <w:sz w:val="20"/>
+      </w:rPr>
+    </w:lvl>
+    <w:lvl w:ilvl="1" w:tentative="1">
+      <w:start w:val="1"/>
+      <w:numFmt w:val="bullet"/>
+      <w:lvlText w:val="o"/>
+      <w:lvlJc w:val="left"/>
+      <w:pPr>
+        <w:tabs>
+          <w:tab w:val="num" w:pos="1440"/>
+        </w:tabs>
+        <w:ind w:left="1440" w:hanging="360"/>
+      </w:pPr>
+      <w:rPr>
+        <w:rFonts w:ascii="Courier New" w:hAnsi="Courier New" w:hint="default"/>
+        <w:sz w:val="20"/>
+      </w:rPr>
+    </w:lvl>
+    <w:lvl w:ilvl="2" w:tentative="1">
+      <w:start w:val="1"/>
+      <w:numFmt w:val="bullet"/>
+      <w:lvlText w:val=""/>
+      <w:lvlJc w:val="left"/>
+      <w:pPr>
+        <w:tabs>
+          <w:tab w:val="num" w:pos="2160"/>
+        </w:tabs>
+        <w:ind w:left="2160" w:hanging="360"/>
+      </w:pPr>
+      <w:rPr>
+        <w:rFonts w:ascii="Wingdings" w:hAnsi="Wingdings" w:hint="default"/>
+        <w:sz w:val="20"/>
+      </w:rPr>
+    </w:lvl>
+    <w:lvl w:ilvl="3" w:tentative="1">
+      <w:start w:val="1"/>
+      <w:numFmt w:val="bullet"/>
+      <w:lvlText w:val=""/>
+      <w:lvlJc w:val="left"/>
+      <w:pPr>
+        <w:tabs>
+          <w:tab w:val="num" w:pos="2880"/>
+        </w:tabs>
+        <w:ind w:left="2880" w:hanging="360"/>
+      </w:pPr>
+      <w:rPr>
+        <w:rFonts w:ascii="Wingdings" w:hAnsi="Wingdings" w:hint="default"/>
+        <w:sz w:val="20"/>
+      </w:rPr>
+    </w:lvl>
+    <w:lvl w:ilvl="4" w:tentative="1">
+      <w:start w:val="1"/>
+      <w:numFmt w:val="bullet"/>
+      <w:lvlText w:val=""/>
+      <w:lvlJc w:val="left"/>
+      <w:pPr>
+        <w:tabs>
+          <w:tab w:val="num" w:pos="3600"/>
+        </w:tabs>
+        <w:ind w:left="3600" w:hanging="360"/>
+      </w:pPr>
+      <w:rPr>
+        <w:rFonts w:ascii="Wingdings" w:hAnsi="Wingdings" w:hint="default"/>
+        <w:sz w:val="20"/>
+      </w:rPr>
+    </w:lvl>
+    <w:lvl w:ilvl="5" w:tentative="1">
+      <w:start w:val="1"/>
+      <w:numFmt w:val="bullet"/>
+      <w:lvlText w:val=""/>
+      <w:lvlJc w:val="left"/>
+      <w:pPr>
+        <w:tabs>
+          <w:tab w:val="num" w:pos="4320"/>
+        </w:tabs>
+        <w:ind w:left="4320" w:hanging="360"/>
+      </w:pPr>
+      <w:rPr>
+        <w:rFonts w:ascii="Wingdings" w:hAnsi="Wingdings" w:hint="default"/>
+        <w:sz w:val="20"/>
+      </w:rPr>
+    </w:lvl>
+    <w:lvl w:ilvl="6" w:tentative="1">
+      <w:start w:val="1"/>
+      <w:numFmt w:val="bullet"/>
+      <w:lvlText w:val=""/>
+      <w:lvlJc w:val="left"/>
+      <w:pPr>
+        <w:tabs>
+          <w:tab w:val="num" w:pos="5040"/>
+        </w:tabs>
+        <w:ind w:left="5040" w:hanging="360"/>
+      </w:pPr>
+      <w:rPr>
+        <w:rFonts w:ascii="Wingdings" w:hAnsi="Wingdings" w:hint="default"/>
+        <w:sz w:val="20"/>
+      </w:rPr>
+    </w:lvl>
+    <w:lvl w:ilvl="7" w:tentative="1">
+      <w:start w:val="1"/>
+      <w:numFmt w:val="bullet"/>
+      <w:lvlText w:val=""/>
+      <w:lvlJc w:val="left"/>
+      <w:pPr>
+        <w:tabs>
+          <w:tab w:val="num" w:pos="5760"/>
+        </w:tabs>
+        <w:ind w:left="5760" w:hanging="360"/>
+      </w:pPr>
+      <w:rPr>
+        <w:rFonts w:ascii="Wingdings" w:hAnsi="Wingdings" w:hint="default"/>
+        <w:sz w:val="20"/>
+      </w:rPr>
+    </w:lvl>
+    <w:lvl w:ilvl="8" w:tentative="1">
+      <w:start w:val="1"/>
+      <w:numFmt w:val="bullet"/>
+      <w:lvlText w:val=""/>
+      <w:lvlJc w:val="left"/>
+      <w:pPr>
+        <w:tabs>
+          <w:tab w:val="num" w:pos="6480"/>
+        </w:tabs>
+        <w:ind w:left="6480" w:hanging="360"/>
+      </w:pPr>
+      <w:rPr>
+        <w:rFonts w:ascii="Wingdings" w:hAnsi="Wingdings" w:hint="default"/>
+        <w:sz w:val="20"/>
+      </w:rPr>
+    </w:lvl>
+  </w:abstractNum>
+  <w:abstractNum w:abstractNumId="5" w15:restartNumberingAfterBreak="0">
+    <w:nsid w:val="56FF2E3E"/>
+    <w:multiLevelType w:val="multilevel"/>
+    <w:tmpl w:val="66D689FC"/>
+    <w:lvl w:ilvl="0">
+      <w:start w:val="1"/>
+      <w:numFmt w:val="bullet"/>
+      <w:lvlText w:val=""/>
+      <w:lvlJc w:val="left"/>
+      <w:pPr>
+        <w:tabs>
+          <w:tab w:val="num" w:pos="720"/>
+        </w:tabs>
+        <w:ind w:left="720" w:hanging="360"/>
+      </w:pPr>
+      <w:rPr>
+        <w:rFonts w:ascii="Symbol" w:hAnsi="Symbol" w:hint="default"/>
+        <w:sz w:val="20"/>
+      </w:rPr>
+    </w:lvl>
+    <w:lvl w:ilvl="1" w:tentative="1">
+      <w:start w:val="1"/>
+      <w:numFmt w:val="bullet"/>
+      <w:lvlText w:val="o"/>
+      <w:lvlJc w:val="left"/>
+      <w:pPr>
+        <w:tabs>
+          <w:tab w:val="num" w:pos="1440"/>
+        </w:tabs>
+        <w:ind w:left="1440" w:hanging="360"/>
+      </w:pPr>
+      <w:rPr>
+        <w:rFonts w:ascii="Courier New" w:hAnsi="Courier New" w:hint="default"/>
+        <w:sz w:val="20"/>
+      </w:rPr>
+    </w:lvl>
+    <w:lvl w:ilvl="2" w:tentative="1">
+      <w:start w:val="1"/>
+      <w:numFmt w:val="bullet"/>
+      <w:lvlText w:val=""/>
+      <w:lvlJc w:val="left"/>
+      <w:pPr>
+        <w:tabs>
+          <w:tab w:val="num" w:pos="2160"/>
+        </w:tabs>
+        <w:ind w:left="2160" w:hanging="360"/>
+      </w:pPr>
+      <w:rPr>
+        <w:rFonts w:ascii="Wingdings" w:hAnsi="Wingdings" w:hint="default"/>
+        <w:sz w:val="20"/>
+      </w:rPr>
+    </w:lvl>
+    <w:lvl w:ilvl="3" w:tentative="1">
+      <w:start w:val="1"/>
+      <w:numFmt w:val="bullet"/>
+      <w:lvlText w:val=""/>
+      <w:lvlJc w:val="left"/>
+      <w:pPr>
+        <w:tabs>
+          <w:tab w:val="num" w:pos="2880"/>
+        </w:tabs>
+        <w:ind w:left="2880" w:hanging="360"/>
+      </w:pPr>
+      <w:rPr>
+        <w:rFonts w:ascii="Wingdings" w:hAnsi="Wingdings" w:hint="default"/>
+        <w:sz w:val="20"/>
+      </w:rPr>
+    </w:lvl>
+    <w:lvl w:ilvl="4" w:tentative="1">
+      <w:start w:val="1"/>
+      <w:numFmt w:val="bullet"/>
+      <w:lvlText w:val=""/>
+      <w:lvlJc w:val="left"/>
+      <w:pPr>
+        <w:tabs>
+          <w:tab w:val="num" w:pos="3600"/>
+        </w:tabs>
+        <w:ind w:left="3600" w:hanging="360"/>
+      </w:pPr>
+      <w:rPr>
+        <w:rFonts w:ascii="Wingdings" w:hAnsi="Wingdings" w:hint="default"/>
+        <w:sz w:val="20"/>
+      </w:rPr>
+    </w:lvl>
+    <w:lvl w:ilvl="5" w:tentative="1">
+      <w:start w:val="1"/>
+      <w:numFmt w:val="bullet"/>
+      <w:lvlText w:val=""/>
+      <w:lvlJc w:val="left"/>
+      <w:pPr>
+        <w:tabs>
+          <w:tab w:val="num" w:pos="4320"/>
+        </w:tabs>
+        <w:ind w:left="4320" w:hanging="360"/>
+      </w:pPr>
+      <w:rPr>
+        <w:rFonts w:ascii="Wingdings" w:hAnsi="Wingdings" w:hint="default"/>
+        <w:sz w:val="20"/>
+      </w:rPr>
+    </w:lvl>
+    <w:lvl w:ilvl="6" w:tentative="1">
+      <w:start w:val="1"/>
+      <w:numFmt w:val="bullet"/>
+      <w:lvlText w:val=""/>
+      <w:lvlJc w:val="left"/>
+      <w:pPr>
+        <w:tabs>
+          <w:tab w:val="num" w:pos="5040"/>
+        </w:tabs>
+        <w:ind w:left="5040" w:hanging="360"/>
+      </w:pPr>
+      <w:rPr>
+        <w:rFonts w:ascii="Wingdings" w:hAnsi="Wingdings" w:hint="default"/>
+        <w:sz w:val="20"/>
+      </w:rPr>
+    </w:lvl>
+    <w:lvl w:ilvl="7" w:tentative="1">
+      <w:start w:val="1"/>
+      <w:numFmt w:val="bullet"/>
+      <w:lvlText w:val=""/>
+      <w:lvlJc w:val="left"/>
+      <w:pPr>
+        <w:tabs>
+          <w:tab w:val="num" w:pos="5760"/>
+        </w:tabs>
+        <w:ind w:left="5760" w:hanging="360"/>
+      </w:pPr>
+      <w:rPr>
+        <w:rFonts w:ascii="Wingdings" w:hAnsi="Wingdings" w:hint="default"/>
+        <w:sz w:val="20"/>
+      </w:rPr>
+    </w:lvl>
+    <w:lvl w:ilvl="8" w:tentative="1">
+      <w:start w:val="1"/>
+      <w:numFmt w:val="bullet"/>
+      <w:lvlText w:val=""/>
+      <w:lvlJc w:val="left"/>
+      <w:pPr>
+        <w:tabs>
+          <w:tab w:val="num" w:pos="6480"/>
+        </w:tabs>
+        <w:ind w:left="6480" w:hanging="360"/>
+      </w:pPr>
+      <w:rPr>
+        <w:rFonts w:ascii="Wingdings" w:hAnsi="Wingdings" w:hint="default"/>
+        <w:sz w:val="20"/>
+      </w:rPr>
+    </w:lvl>
+  </w:abstractNum>
+  <w:abstractNum w:abstractNumId="6" w15:restartNumberingAfterBreak="0">
+    <w:nsid w:val="581554AD"/>
+    <w:multiLevelType w:val="multilevel"/>
+    <w:tmpl w:val="6FEE970A"/>
+    <w:lvl w:ilvl="0">
+      <w:start w:val="1"/>
+      <w:numFmt w:val="bullet"/>
+      <w:lvlText w:val=""/>
+      <w:lvlJc w:val="left"/>
+      <w:pPr>
+        <w:tabs>
+          <w:tab w:val="num" w:pos="720"/>
+        </w:tabs>
+        <w:ind w:left="720" w:hanging="360"/>
+      </w:pPr>
+      <w:rPr>
+        <w:rFonts w:ascii="Symbol" w:hAnsi="Symbol" w:hint="default"/>
+        <w:sz w:val="20"/>
+      </w:rPr>
+    </w:lvl>
+    <w:lvl w:ilvl="1" w:tentative="1">
+      <w:start w:val="1"/>
+      <w:numFmt w:val="bullet"/>
+      <w:lvlText w:val="o"/>
+      <w:lvlJc w:val="left"/>
+      <w:pPr>
+        <w:tabs>
+          <w:tab w:val="num" w:pos="1440"/>
+        </w:tabs>
+        <w:ind w:left="1440" w:hanging="360"/>
+      </w:pPr>
+      <w:rPr>
+        <w:rFonts w:ascii="Courier New" w:hAnsi="Courier New" w:hint="default"/>
+        <w:sz w:val="20"/>
+      </w:rPr>
+    </w:lvl>
+    <w:lvl w:ilvl="2" w:tentative="1">
+      <w:start w:val="1"/>
+      <w:numFmt w:val="bullet"/>
+      <w:lvlText w:val=""/>
+      <w:lvlJc w:val="left"/>
+      <w:pPr>
+        <w:tabs>
+          <w:tab w:val="num" w:pos="2160"/>
+        </w:tabs>
+        <w:ind w:left="2160" w:hanging="360"/>
+      </w:pPr>
+      <w:rPr>
+        <w:rFonts w:ascii="Wingdings" w:hAnsi="Wingdings" w:hint="default"/>
+        <w:sz w:val="20"/>
+      </w:rPr>
+    </w:lvl>
+    <w:lvl w:ilvl="3" w:tentative="1">
+      <w:start w:val="1"/>
+      <w:numFmt w:val="bullet"/>
+      <w:lvlText w:val=""/>
+      <w:lvlJc w:val="left"/>
+      <w:pPr>
+        <w:tabs>
+          <w:tab w:val="num" w:pos="2880"/>
+        </w:tabs>
+        <w:ind w:left="2880" w:hanging="360"/>
+      </w:pPr>
+      <w:rPr>
+        <w:rFonts w:ascii="Wingdings" w:hAnsi="Wingdings" w:hint="default"/>
+        <w:sz w:val="20"/>
+      </w:rPr>
+    </w:lvl>
+    <w:lvl w:ilvl="4" w:tentative="1">
+      <w:start w:val="1"/>
+      <w:numFmt w:val="bullet"/>
+      <w:lvlText w:val=""/>
+      <w:lvlJc w:val="left"/>
+      <w:pPr>
+        <w:tabs>
+          <w:tab w:val="num" w:pos="3600"/>
+        </w:tabs>
+        <w:ind w:left="3600" w:hanging="360"/>
+      </w:pPr>
+      <w:rPr>
+        <w:rFonts w:ascii="Wingdings" w:hAnsi="Wingdings" w:hint="default"/>
+        <w:sz w:val="20"/>
+      </w:rPr>
+    </w:lvl>
+    <w:lvl w:ilvl="5" w:tentative="1">
+      <w:start w:val="1"/>
+      <w:numFmt w:val="bullet"/>
+      <w:lvlText w:val=""/>
+      <w:lvlJc w:val="left"/>
+      <w:pPr>
+        <w:tabs>
+          <w:tab w:val="num" w:pos="4320"/>
+        </w:tabs>
+        <w:ind w:left="4320" w:hanging="360"/>
+      </w:pPr>
+      <w:rPr>
+        <w:rFonts w:ascii="Wingdings" w:hAnsi="Wingdings" w:hint="default"/>
+        <w:sz w:val="20"/>
+      </w:rPr>
+    </w:lvl>
+    <w:lvl w:ilvl="6" w:tentative="1">
+      <w:start w:val="1"/>
+      <w:numFmt w:val="bullet"/>
+      <w:lvlText w:val=""/>
+      <w:lvlJc w:val="left"/>
+      <w:pPr>
+        <w:tabs>
+          <w:tab w:val="num" w:pos="5040"/>
+        </w:tabs>
+        <w:ind w:left="5040" w:hanging="360"/>
+      </w:pPr>
+      <w:rPr>
+        <w:rFonts w:ascii="Wingdings" w:hAnsi="Wingdings" w:hint="default"/>
+        <w:sz w:val="20"/>
+      </w:rPr>
+    </w:lvl>
+    <w:lvl w:ilvl="7" w:tentative="1">
+      <w:start w:val="1"/>
+      <w:numFmt w:val="bullet"/>
+      <w:lvlText w:val=""/>
+      <w:lvlJc w:val="left"/>
+      <w:pPr>
+        <w:tabs>
+          <w:tab w:val="num" w:pos="5760"/>
+        </w:tabs>
+        <w:ind w:left="5760" w:hanging="360"/>
+      </w:pPr>
+      <w:rPr>
+        <w:rFonts w:ascii="Wingdings" w:hAnsi="Wingdings" w:hint="default"/>
+        <w:sz w:val="20"/>
+      </w:rPr>
+    </w:lvl>
+    <w:lvl w:ilvl="8" w:tentative="1">
+      <w:start w:val="1"/>
+      <w:numFmt w:val="bullet"/>
+      <w:lvlText w:val=""/>
+      <w:lvlJc w:val="left"/>
+      <w:pPr>
+        <w:tabs>
+          <w:tab w:val="num" w:pos="6480"/>
+        </w:tabs>
+        <w:ind w:left="6480" w:hanging="360"/>
+      </w:pPr>
+      <w:rPr>
+        <w:rFonts w:ascii="Wingdings" w:hAnsi="Wingdings" w:hint="default"/>
+        <w:sz w:val="20"/>
+      </w:rPr>
+    </w:lvl>
+  </w:abstractNum>
+  <w:abstractNum w:abstractNumId="7" w15:restartNumberingAfterBreak="0">
+    <w:nsid w:val="642659B7"/>
+    <w:multiLevelType w:val="multilevel"/>
+    <w:tmpl w:val="F70E7DAC"/>
+    <w:lvl w:ilvl="0">
+      <w:start w:val="1"/>
+      <w:numFmt w:val="bullet"/>
+      <w:lvlText w:val=""/>
+      <w:lvlJc w:val="left"/>
+      <w:pPr>
+        <w:tabs>
+          <w:tab w:val="num" w:pos="720"/>
+        </w:tabs>
+        <w:ind w:left="720" w:hanging="360"/>
+      </w:pPr>
+      <w:rPr>
+        <w:rFonts w:ascii="Symbol" w:hAnsi="Symbol" w:hint="default"/>
+        <w:sz w:val="20"/>
+      </w:rPr>
+    </w:lvl>
+    <w:lvl w:ilvl="1">
+      <w:start w:val="1"/>
+      <w:numFmt w:val="bullet"/>
+      <w:lvlText w:val="o"/>
+      <w:lvlJc w:val="left"/>
+      <w:pPr>
+        <w:tabs>
+          <w:tab w:val="num" w:pos="1440"/>
+        </w:tabs>
+        <w:ind w:left="1440" w:hanging="360"/>
+      </w:pPr>
+      <w:rPr>
+        <w:rFonts w:ascii="Courier New" w:hAnsi="Courier New" w:hint="default"/>
+        <w:sz w:val="20"/>
+      </w:rPr>
+    </w:lvl>
+    <w:lvl w:ilvl="2" w:tentative="1">
+      <w:start w:val="1"/>
+      <w:numFmt w:val="bullet"/>
+      <w:lvlText w:val=""/>
+      <w:lvlJc w:val="left"/>
+      <w:pPr>
+        <w:tabs>
+          <w:tab w:val="num" w:pos="2160"/>
+        </w:tabs>
+        <w:ind w:left="2160" w:hanging="360"/>
+      </w:pPr>
+      <w:rPr>
+        <w:rFonts w:ascii="Wingdings" w:hAnsi="Wingdings" w:hint="default"/>
+        <w:sz w:val="20"/>
+      </w:rPr>
+    </w:lvl>
+    <w:lvl w:ilvl="3" w:tentative="1">
+      <w:start w:val="1"/>
+      <w:numFmt w:val="bullet"/>
+      <w:lvlText w:val=""/>
+      <w:lvlJc w:val="left"/>
+      <w:pPr>
+        <w:tabs>
+          <w:tab w:val="num" w:pos="2880"/>
+        </w:tabs>
+        <w:ind w:left="2880" w:hanging="360"/>
+      </w:pPr>
+      <w:rPr>
+        <w:rFonts w:ascii="Wingdings" w:hAnsi="Wingdings" w:hint="default"/>
+        <w:sz w:val="20"/>
+      </w:rPr>
+    </w:lvl>
+    <w:lvl w:ilvl="4" w:tentative="1">
+      <w:start w:val="1"/>
+      <w:numFmt w:val="bullet"/>
+      <w:lvlText w:val=""/>
+      <w:lvlJc w:val="left"/>
+      <w:pPr>
+        <w:tabs>
+          <w:tab w:val="num" w:pos="3600"/>
+        </w:tabs>
+        <w:ind w:left="3600" w:hanging="360"/>
+      </w:pPr>
+      <w:rPr>
+        <w:rFonts w:ascii="Wingdings" w:hAnsi="Wingdings" w:hint="default"/>
+        <w:sz w:val="20"/>
+      </w:rPr>
+    </w:lvl>
+    <w:lvl w:ilvl="5" w:tentative="1">
+      <w:start w:val="1"/>
+      <w:numFmt w:val="bullet"/>
+      <w:lvlText w:val=""/>
+      <w:lvlJc w:val="left"/>
+      <w:pPr>
+        <w:tabs>
+          <w:tab w:val="num" w:pos="4320"/>
+        </w:tabs>
+        <w:ind w:left="4320" w:hanging="360"/>
+      </w:pPr>
+      <w:rPr>
+        <w:rFonts w:ascii="Wingdings" w:hAnsi="Wingdings" w:hint="default"/>
+        <w:sz w:val="20"/>
+      </w:rPr>
+    </w:lvl>
+    <w:lvl w:ilvl="6" w:tentative="1">
+      <w:start w:val="1"/>
+      <w:numFmt w:val="bullet"/>
+      <w:lvlText w:val=""/>
+      <w:lvlJc w:val="left"/>
+      <w:pPr>
+        <w:tabs>
+          <w:tab w:val="num" w:pos="5040"/>
+        </w:tabs>
+        <w:ind w:left="5040" w:hanging="360"/>
+      </w:pPr>
+      <w:rPr>
+        <w:rFonts w:ascii="Wingdings" w:hAnsi="Wingdings" w:hint="default"/>
+        <w:sz w:val="20"/>
+      </w:rPr>
+    </w:lvl>
+    <w:lvl w:ilvl="7" w:tentative="1">
+      <w:start w:val="1"/>
+      <w:numFmt w:val="bullet"/>
+      <w:lvlText w:val=""/>
+      <w:lvlJc w:val="left"/>
+      <w:pPr>
+        <w:tabs>
+          <w:tab w:val="num" w:pos="5760"/>
+        </w:tabs>
+        <w:ind w:left="5760" w:hanging="360"/>
+      </w:pPr>
+      <w:rPr>
+        <w:rFonts w:ascii="Wingdings" w:hAnsi="Wingdings" w:hint="default"/>
+        <w:sz w:val="20"/>
+      </w:rPr>
+    </w:lvl>
+    <w:lvl w:ilvl="8" w:tentative="1">
+      <w:start w:val="1"/>
+      <w:numFmt w:val="bullet"/>
+      <w:lvlText w:val=""/>
+      <w:lvlJc w:val="left"/>
+      <w:pPr>
+        <w:tabs>
+          <w:tab w:val="num" w:pos="6480"/>
+        </w:tabs>
+        <w:ind w:left="6480" w:hanging="360"/>
+      </w:pPr>
+      <w:rPr>
+        <w:rFonts w:ascii="Wingdings" w:hAnsi="Wingdings" w:hint="default"/>
+        <w:sz w:val="20"/>
+      </w:rPr>
+    </w:lvl>
+  </w:abstractNum>
+  <w:abstractNum w:abstractNumId="8" w15:restartNumberingAfterBreak="0">
+    <w:nsid w:val="64D92A82"/>
+    <w:multiLevelType w:val="multilevel"/>
+    <w:tmpl w:val="D4429A0E"/>
+    <w:lvl w:ilvl="0">
+      <w:start w:val="1"/>
+      <w:numFmt w:val="bullet"/>
+      <w:lvlText w:val=""/>
+      <w:lvlJc w:val="left"/>
+      <w:pPr>
+        <w:tabs>
+          <w:tab w:val="num" w:pos="720"/>
+        </w:tabs>
+        <w:ind w:left="720" w:hanging="360"/>
+      </w:pPr>
+      <w:rPr>
+        <w:rFonts w:ascii="Symbol" w:hAnsi="Symbol" w:hint="default"/>
+        <w:sz w:val="20"/>
+      </w:rPr>
+    </w:lvl>
+    <w:lvl w:ilvl="1" w:tentative="1">
+      <w:start w:val="1"/>
+      <w:numFmt w:val="bullet"/>
+      <w:lvlText w:val="o"/>
+      <w:lvlJc w:val="left"/>
+      <w:pPr>
+        <w:tabs>
+          <w:tab w:val="num" w:pos="1440"/>
+        </w:tabs>
+        <w:ind w:left="1440" w:hanging="360"/>
+      </w:pPr>
+      <w:rPr>
+        <w:rFonts w:ascii="Courier New" w:hAnsi="Courier New" w:hint="default"/>
+        <w:sz w:val="20"/>
+      </w:rPr>
+    </w:lvl>
+    <w:lvl w:ilvl="2" w:tentative="1">
+      <w:start w:val="1"/>
+      <w:numFmt w:val="bullet"/>
+      <w:lvlText w:val=""/>
+      <w:lvlJc w:val="left"/>
+      <w:pPr>
+        <w:tabs>
+          <w:tab w:val="num" w:pos="2160"/>
+        </w:tabs>
+        <w:ind w:left="2160" w:hanging="360"/>
+      </w:pPr>
+      <w:rPr>
+        <w:rFonts w:ascii="Wingdings" w:hAnsi="Wingdings" w:hint="default"/>
+        <w:sz w:val="20"/>
+      </w:rPr>
+    </w:lvl>
+    <w:lvl w:ilvl="3" w:tentative="1">
+      <w:start w:val="1"/>
+      <w:numFmt w:val="bullet"/>
+      <w:lvlText w:val=""/>
+      <w:lvlJc w:val="left"/>
+      <w:pPr>
+        <w:tabs>
+          <w:tab w:val="num" w:pos="2880"/>
+        </w:tabs>
+        <w:ind w:left="2880" w:hanging="360"/>
+      </w:pPr>
+      <w:rPr>
+        <w:rFonts w:ascii="Wingdings" w:hAnsi="Wingdings" w:hint="default"/>
+        <w:sz w:val="20"/>
+      </w:rPr>
+    </w:lvl>
+    <w:lvl w:ilvl="4" w:tentative="1">
+      <w:start w:val="1"/>
+      <w:numFmt w:val="bullet"/>
+      <w:lvlText w:val=""/>
+      <w:lvlJc w:val="left"/>
+      <w:pPr>
+        <w:tabs>
+          <w:tab w:val="num" w:pos="3600"/>
+        </w:tabs>
+        <w:ind w:left="3600" w:hanging="360"/>
+      </w:pPr>
+      <w:rPr>
+        <w:rFonts w:ascii="Wingdings" w:hAnsi="Wingdings" w:hint="default"/>
+        <w:sz w:val="20"/>
+      </w:rPr>
+    </w:lvl>
+    <w:lvl w:ilvl="5" w:tentative="1">
+      <w:start w:val="1"/>
+      <w:numFmt w:val="bullet"/>
+      <w:lvlText w:val=""/>
+      <w:lvlJc w:val="left"/>
+      <w:pPr>
+        <w:tabs>
+          <w:tab w:val="num" w:pos="4320"/>
+        </w:tabs>
+        <w:ind w:left="4320" w:hanging="360"/>
+      </w:pPr>
+      <w:rPr>
+        <w:rFonts w:ascii="Wingdings" w:hAnsi="Wingdings" w:hint="default"/>
+        <w:sz w:val="20"/>
+      </w:rPr>
+    </w:lvl>
+    <w:lvl w:ilvl="6" w:tentative="1">
+      <w:start w:val="1"/>
+      <w:numFmt w:val="bullet"/>
+      <w:lvlText w:val=""/>
+      <w:lvlJc w:val="left"/>
+      <w:pPr>
+        <w:tabs>
+          <w:tab w:val="num" w:pos="5040"/>
+        </w:tabs>
+        <w:ind w:left="5040" w:hanging="360"/>
+      </w:pPr>
+      <w:rPr>
+        <w:rFonts w:ascii="Wingdings" w:hAnsi="Wingdings" w:hint="default"/>
+        <w:sz w:val="20"/>
+      </w:rPr>
+    </w:lvl>
+    <w:lvl w:ilvl="7" w:tentative="1">
+      <w:start w:val="1"/>
+      <w:numFmt w:val="bullet"/>
+      <w:lvlText w:val=""/>
+      <w:lvlJc w:val="left"/>
+      <w:pPr>
+        <w:tabs>
+          <w:tab w:val="num" w:pos="5760"/>
+        </w:tabs>
+        <w:ind w:left="5760" w:hanging="360"/>
+      </w:pPr>
+      <w:rPr>
+        <w:rFonts w:ascii="Wingdings" w:hAnsi="Wingdings" w:hint="default"/>
+        <w:sz w:val="20"/>
+      </w:rPr>
+    </w:lvl>
+    <w:lvl w:ilvl="8" w:tentative="1">
+      <w:start w:val="1"/>
+      <w:numFmt w:val="bullet"/>
+      <w:lvlText w:val=""/>
+      <w:lvlJc w:val="left"/>
+      <w:pPr>
+        <w:tabs>
+          <w:tab w:val="num" w:pos="6480"/>
+        </w:tabs>
+        <w:ind w:left="6480" w:hanging="360"/>
+      </w:pPr>
+      <w:rPr>
+        <w:rFonts w:ascii="Wingdings" w:hAnsi="Wingdings" w:hint="default"/>
+        <w:sz w:val="20"/>
+      </w:rPr>
+    </w:lvl>
+  </w:abstractNum>
+  <w:abstractNum w:abstractNumId="9" w15:restartNumberingAfterBreak="0">
+    <w:nsid w:val="72CE2541"/>
+    <w:multiLevelType w:val="multilevel"/>
+    <w:tmpl w:val="F41EC2E0"/>
+    <w:lvl w:ilvl="0">
+      <w:start w:val="1"/>
+      <w:numFmt w:val="bullet"/>
+      <w:lvlText w:val=""/>
+      <w:lvlJc w:val="left"/>
+      <w:pPr>
+        <w:tabs>
+          <w:tab w:val="num" w:pos="720"/>
+        </w:tabs>
+        <w:ind w:left="720" w:hanging="360"/>
+      </w:pPr>
+      <w:rPr>
+        <w:rFonts w:ascii="Symbol" w:hAnsi="Symbol" w:hint="default"/>
+        <w:sz w:val="20"/>
+      </w:rPr>
+    </w:lvl>
+    <w:lvl w:ilvl="1" w:tentative="1">
+      <w:start w:val="1"/>
+      <w:numFmt w:val="bullet"/>
+      <w:lvlText w:val="o"/>
+      <w:lvlJc w:val="left"/>
+      <w:pPr>
+        <w:tabs>
+          <w:tab w:val="num" w:pos="1440"/>
+        </w:tabs>
+        <w:ind w:left="1440" w:hanging="360"/>
+      </w:pPr>
+      <w:rPr>
+        <w:rFonts w:ascii="Courier New" w:hAnsi="Courier New" w:hint="default"/>
+        <w:sz w:val="20"/>
+      </w:rPr>
+    </w:lvl>
+    <w:lvl w:ilvl="2" w:tentative="1">
+      <w:start w:val="1"/>
+      <w:numFmt w:val="bullet"/>
+      <w:lvlText w:val=""/>
+      <w:lvlJc w:val="left"/>
+      <w:pPr>
+        <w:tabs>
+          <w:tab w:val="num" w:pos="2160"/>
+        </w:tabs>
+        <w:ind w:left="2160" w:hanging="360"/>
+      </w:pPr>
+      <w:rPr>
+        <w:rFonts w:ascii="Wingdings" w:hAnsi="Wingdings" w:hint="default"/>
+        <w:sz w:val="20"/>
+      </w:rPr>
+    </w:lvl>
+    <w:lvl w:ilvl="3" w:tentative="1">
+      <w:start w:val="1"/>
+      <w:numFmt w:val="bullet"/>
+      <w:lvlText w:val=""/>
+      <w:lvlJc w:val="left"/>
+      <w:pPr>
+        <w:tabs>
+          <w:tab w:val="num" w:pos="2880"/>
+        </w:tabs>
+        <w:ind w:left="2880" w:hanging="360"/>
+      </w:pPr>
+      <w:rPr>
+        <w:rFonts w:ascii="Wingdings" w:hAnsi="Wingdings" w:hint="default"/>
+        <w:sz w:val="20"/>
+      </w:rPr>
+    </w:lvl>
+    <w:lvl w:ilvl="4" w:tentative="1">
+      <w:start w:val="1"/>
+      <w:numFmt w:val="bullet"/>
+      <w:lvlText w:val=""/>
+      <w:lvlJc w:val="left"/>
+      <w:pPr>
+        <w:tabs>
+          <w:tab w:val="num" w:pos="3600"/>
+        </w:tabs>
+        <w:ind w:left="3600" w:hanging="360"/>
+      </w:pPr>
+      <w:rPr>
+        <w:rFonts w:ascii="Wingdings" w:hAnsi="Wingdings" w:hint="default"/>
+        <w:sz w:val="20"/>
+      </w:rPr>
+    </w:lvl>
+    <w:lvl w:ilvl="5" w:tentative="1">
+      <w:start w:val="1"/>
+      <w:numFmt w:val="bullet"/>
+      <w:lvlText w:val=""/>
+      <w:lvlJc w:val="left"/>
+      <w:pPr>
+        <w:tabs>
+          <w:tab w:val="num" w:pos="4320"/>
+        </w:tabs>
+        <w:ind w:left="4320" w:hanging="360"/>
+      </w:pPr>
+      <w:rPr>
+        <w:rFonts w:ascii="Wingdings" w:hAnsi="Wingdings" w:hint="default"/>
+        <w:sz w:val="20"/>
+      </w:rPr>
+    </w:lvl>
+    <w:lvl w:ilvl="6" w:tentative="1">
+      <w:start w:val="1"/>
+      <w:numFmt w:val="bullet"/>
+      <w:lvlText w:val=""/>
+      <w:lvlJc w:val="left"/>
+      <w:pPr>
+        <w:tabs>
+          <w:tab w:val="num" w:pos="5040"/>
+        </w:tabs>
+        <w:ind w:left="5040" w:hanging="360"/>
+      </w:pPr>
+      <w:rPr>
+        <w:rFonts w:ascii="Wingdings" w:hAnsi="Wingdings" w:hint="default"/>
+        <w:sz w:val="20"/>
+      </w:rPr>
+    </w:lvl>
+    <w:lvl w:ilvl="7" w:tentative="1">
+      <w:start w:val="1"/>
+      <w:numFmt w:val="bullet"/>
+      <w:lvlText w:val=""/>
+      <w:lvlJc w:val="left"/>
+      <w:pPr>
+        <w:tabs>
+          <w:tab w:val="num" w:pos="5760"/>
+        </w:tabs>
+        <w:ind w:left="5760" w:hanging="360"/>
+      </w:pPr>
+      <w:rPr>
+        <w:rFonts w:ascii="Wingdings" w:hAnsi="Wingdings" w:hint="default"/>
+        <w:sz w:val="20"/>
+      </w:rPr>
+    </w:lvl>
+    <w:lvl w:ilvl="8" w:tentative="1">
+      <w:start w:val="1"/>
+      <w:numFmt w:val="bullet"/>
+      <w:lvlText w:val=""/>
+      <w:lvlJc w:val="left"/>
+      <w:pPr>
+        <w:tabs>
+          <w:tab w:val="num" w:pos="6480"/>
+        </w:tabs>
+        <w:ind w:left="6480" w:hanging="360"/>
+      </w:pPr>
+      <w:rPr>
+        <w:rFonts w:ascii="Wingdings" w:hAnsi="Wingdings" w:hint="default"/>
+        <w:sz w:val="20"/>
+      </w:rPr>
+    </w:lvl>
+  </w:abstractNum>
+  <w:num w:numId="1" w16cid:durableId="1130712105">
+    <w:abstractNumId w:val="0"/>
+  </w:num>
+  <w:num w:numId="2" w16cid:durableId="1651445328">
+    <w:abstractNumId w:val="7"/>
+  </w:num>
+  <w:num w:numId="3" w16cid:durableId="1018190468">
+    <w:abstractNumId w:val="2"/>
+  </w:num>
+  <w:num w:numId="4" w16cid:durableId="1637225053">
+    <w:abstractNumId w:val="1"/>
+  </w:num>
+  <w:num w:numId="5" w16cid:durableId="72508314">
+    <w:abstractNumId w:val="5"/>
+  </w:num>
+  <w:num w:numId="6" w16cid:durableId="1876649258">
+    <w:abstractNumId w:val="4"/>
+  </w:num>
+  <w:num w:numId="7" w16cid:durableId="2129084322">
+    <w:abstractNumId w:val="6"/>
+  </w:num>
+  <w:num w:numId="8" w16cid:durableId="1367489424">
+    <w:abstractNumId w:val="8"/>
+  </w:num>
+  <w:num w:numId="9" w16cid:durableId="1488475314">
+    <w:abstractNumId w:val="3"/>
+  </w:num>
+  <w:num w:numId="10" w16cid:durableId="1273318435">
+    <w:abstractNumId w:val="9"/>
+  </w:num>
+</w:numbering>
 </file>
 
 <file path=word/styles.xml><?xml version="1.0" encoding="utf-8"?>
@@ -598,7 +2710,6 @@
     <w:next w:val="Normal"/>
     <w:link w:val="Heading4Char"/>
     <w:uiPriority w:val="9"/>
-    <w:semiHidden/>
     <w:unhideWhenUsed/>
     <w:qFormat/>
     <w:rsid w:val="00D214B2"/>
@@ -727,7 +2838,6 @@
   <w:style w:type="character" w:default="1" w:styleId="DefaultParagraphFont">
     <w:name w:val="Default Paragraph Font"/>
     <w:uiPriority w:val="1"/>
-    <w:semiHidden/>
     <w:unhideWhenUsed/>
   </w:style>
   <w:style w:type="table" w:default="1" w:styleId="TableNormal">
@@ -797,7 +2907,6 @@
     <w:basedOn w:val="DefaultParagraphFont"/>
     <w:link w:val="Heading4"/>
     <w:uiPriority w:val="9"/>
-    <w:semiHidden/>
     <w:rsid w:val="00D214B2"/>
     <w:rPr>
       <w:rFonts w:eastAsiaTheme="majorEastAsia" w:cstheme="majorBidi"/>

</xml_diff>